<commit_message>
Final Code and Plots!
</commit_message>
<xml_diff>
--- a/Results.docx
+++ b/Results.docx
@@ -654,418 +654,422 @@
       </w:pPr>
     </w:p>
     <w:p>
-      <w:r>
+      <w:pPr>
         <w:rPr>
           <w:rFonts w:ascii="Segoe UI Emoji" w:hAnsi="Segoe UI Emoji" w:cs="Segoe UI Emoji"/>
+        </w:rPr>
+      </w:pPr>
+      <w:r>
+        <w:rPr>
+          <w:rFonts w:ascii="Segoe UI Emoji" w:hAnsi="Segoe UI Emoji" w:cs="Segoe UI Emoji"/>
+        </w:rPr>
+        <w:lastRenderedPageBreak/>
+        <w:t>TOTALE</w:t>
+      </w:r>
+    </w:p>
+    <w:p>
+      <w:r>
+        <w:rPr>
+          <w:rFonts w:ascii="Segoe UI Emoji" w:hAnsi="Segoe UI Emoji" w:cs="Segoe UI Emoji"/>
+        </w:rPr>
+        <w:t>✅</w:t>
+      </w:r>
+      <w:r>
+        <w:t xml:space="preserve"> TUNING CNN COMPLETATO! Migliori Parametri</w:t>
+      </w:r>
+      <w:r>
+        <w:t xml:space="preserve"> CNN with MAE</w:t>
+      </w:r>
+      <w:r>
+        <w:t>:</w:t>
+      </w:r>
+    </w:p>
+    <w:p>
+      <w:pPr>
+        <w:rPr>
+          <w:lang w:val="en-GB"/>
+        </w:rPr>
+      </w:pPr>
+      <w:r>
+        <w:t xml:space="preserve">    </w:t>
+      </w:r>
+      <w:r>
+        <w:rPr>
+          <w:lang w:val="en-GB"/>
+        </w:rPr>
+        <w:t>---------------------------------------------</w:t>
+      </w:r>
+    </w:p>
+    <w:p>
+      <w:pPr>
+        <w:rPr>
+          <w:lang w:val="en-GB"/>
+        </w:rPr>
+      </w:pPr>
+      <w:r>
+        <w:rPr>
+          <w:lang w:val="en-GB"/>
+        </w:rPr>
+        <w:t>    Filters:           32</w:t>
+      </w:r>
+    </w:p>
+    <w:p>
+      <w:pPr>
+        <w:rPr>
+          <w:lang w:val="en-GB"/>
+        </w:rPr>
+      </w:pPr>
+      <w:r>
+        <w:rPr>
+          <w:lang w:val="en-GB"/>
+        </w:rPr>
+        <w:t>    Kernel Size:       2</w:t>
+      </w:r>
+    </w:p>
+    <w:p>
+      <w:pPr>
+        <w:rPr>
+          <w:lang w:val="en-GB"/>
+        </w:rPr>
+      </w:pPr>
+      <w:r>
+        <w:rPr>
+          <w:lang w:val="en-GB"/>
+        </w:rPr>
+        <w:t>    Second Layer?:     True</w:t>
+      </w:r>
+    </w:p>
+    <w:p>
+      <w:pPr>
+        <w:rPr>
+          <w:lang w:val="en-GB"/>
+        </w:rPr>
+      </w:pPr>
+      <w:r>
+        <w:rPr>
+          <w:lang w:val="en-GB"/>
+        </w:rPr>
+        <w:t>    Dense Context:     48</w:t>
+      </w:r>
+    </w:p>
+    <w:p>
+      <w:pPr>
+        <w:rPr>
+          <w:lang w:val="en-GB"/>
+        </w:rPr>
+      </w:pPr>
+      <w:r>
+        <w:rPr>
+          <w:lang w:val="en-GB"/>
+        </w:rPr>
+        <w:t>    Dense Final:       32</w:t>
+      </w:r>
+    </w:p>
+    <w:p>
+      <w:pPr>
+        <w:rPr>
+          <w:lang w:val="en-GB"/>
+        </w:rPr>
+      </w:pPr>
+      <w:r>
+        <w:rPr>
+          <w:lang w:val="en-GB"/>
+        </w:rPr>
+        <w:t>    Dropout Rate:      0.30000000000000004</w:t>
+      </w:r>
+    </w:p>
+    <w:p>
+      <w:pPr>
+        <w:rPr>
+          <w:lang w:val="en-GB"/>
+        </w:rPr>
+      </w:pPr>
+      <w:r>
+        <w:rPr>
+          <w:lang w:val="en-GB"/>
+        </w:rPr>
+        <w:t xml:space="preserve">    </w:t>
+      </w:r>
+      <w:r>
+        <w:rPr>
+          <w:lang w:val="en-GB"/>
+        </w:rPr>
+        <w:t>Learning Rate:     0.001</w:t>
+      </w:r>
+    </w:p>
+    <w:p>
+      <w:pPr>
+        <w:rPr>
+          <w:lang w:val="en-GB"/>
+        </w:rPr>
+      </w:pPr>
+      <w:r>
+        <w:rPr>
+          <w:lang w:val="en-GB"/>
+        </w:rPr>
+        <w:t>    Cosine Weight:     5.0</w:t>
+      </w:r>
+    </w:p>
+    <w:p>
+      <w:pPr>
+        <w:rPr>
+          <w:lang w:val="en-GB"/>
+        </w:rPr>
+      </w:pPr>
+      <w:r>
+        <w:rPr>
+          <w:lang w:val="en-GB"/>
+        </w:rPr>
+        <w:t xml:space="preserve">    N_PAST = 3</w:t>
+      </w:r>
+    </w:p>
+    <w:p>
+      <w:pPr>
+        <w:rPr>
+          <w:lang w:val="en-GB"/>
+        </w:rPr>
+      </w:pPr>
+    </w:p>
+    <w:p>
+      <w:r>
+        <w:rPr>
+          <w:rFonts w:ascii="Segoe UI Emoji" w:hAnsi="Segoe UI Emoji" w:cs="Segoe UI Emoji"/>
+          <w:lang w:val="en-GB"/>
+        </w:rPr>
+        <w:t>✅</w:t>
+      </w:r>
+      <w:r>
+        <w:rPr>
+          <w:lang w:val="en-GB"/>
+        </w:rPr>
+        <w:t xml:space="preserve"> TUNING CNN COMPLETATO! </w:t>
+      </w:r>
+      <w:r>
+        <w:t>Migliori Parametri</w:t>
+      </w:r>
+      <w:r>
+        <w:t xml:space="preserve"> CNN with Custom Loss</w:t>
+      </w:r>
+      <w:r>
+        <w:t>:</w:t>
+      </w:r>
+    </w:p>
+    <w:p>
+      <w:pPr>
+        <w:rPr>
+          <w:lang w:val="en-GB"/>
+        </w:rPr>
+      </w:pPr>
+      <w:r>
+        <w:t xml:space="preserve">    </w:t>
+      </w:r>
+      <w:r>
+        <w:rPr>
+          <w:lang w:val="en-GB"/>
+        </w:rPr>
+        <w:t>---------------------------------------------</w:t>
+      </w:r>
+    </w:p>
+    <w:p>
+      <w:pPr>
+        <w:rPr>
+          <w:lang w:val="en-GB"/>
+        </w:rPr>
+      </w:pPr>
+      <w:r>
+        <w:rPr>
+          <w:lang w:val="en-GB"/>
+        </w:rPr>
+        <w:t>    Filters:           96</w:t>
+      </w:r>
+    </w:p>
+    <w:p>
+      <w:pPr>
+        <w:rPr>
+          <w:lang w:val="en-GB"/>
+        </w:rPr>
+      </w:pPr>
+      <w:r>
+        <w:rPr>
+          <w:lang w:val="en-GB"/>
+        </w:rPr>
+        <w:t>    Kernel Size:       3</w:t>
+      </w:r>
+    </w:p>
+    <w:p>
+      <w:pPr>
+        <w:rPr>
+          <w:lang w:val="en-GB"/>
+        </w:rPr>
+      </w:pPr>
+      <w:r>
+        <w:rPr>
+          <w:lang w:val="en-GB"/>
+        </w:rPr>
+        <w:t>    Second Layer?:     False</w:t>
+      </w:r>
+    </w:p>
+    <w:p>
+      <w:pPr>
+        <w:rPr>
+          <w:lang w:val="en-GB"/>
+        </w:rPr>
+      </w:pPr>
+      <w:r>
+        <w:rPr>
+          <w:lang w:val="en-GB"/>
+        </w:rPr>
+        <w:t>    Dense Context:     48</w:t>
+      </w:r>
+    </w:p>
+    <w:p>
+      <w:pPr>
+        <w:rPr>
+          <w:lang w:val="en-GB"/>
+        </w:rPr>
+      </w:pPr>
+      <w:r>
+        <w:rPr>
+          <w:lang w:val="en-GB"/>
+        </w:rPr>
+        <w:t>    Dense Final:       64</w:t>
+      </w:r>
+    </w:p>
+    <w:p>
+      <w:pPr>
+        <w:rPr>
+          <w:lang w:val="en-GB"/>
+        </w:rPr>
+      </w:pPr>
+      <w:r>
+        <w:rPr>
+          <w:lang w:val="en-GB"/>
+        </w:rPr>
+        <w:t>    Dropout Rate:      0.30000000000000004</w:t>
+      </w:r>
+    </w:p>
+    <w:p>
+      <w:pPr>
+        <w:rPr>
+          <w:lang w:val="en-GB"/>
+        </w:rPr>
+      </w:pPr>
+      <w:r>
+        <w:rPr>
+          <w:lang w:val="en-GB"/>
+        </w:rPr>
+        <w:t xml:space="preserve">    </w:t>
+      </w:r>
+      <w:r>
+        <w:rPr>
+          <w:lang w:val="en-GB"/>
+        </w:rPr>
+        <w:t>Learning Rate:     0.0005</w:t>
+      </w:r>
+    </w:p>
+    <w:p>
+      <w:pPr>
+        <w:rPr>
+          <w:lang w:val="en-GB"/>
+        </w:rPr>
+      </w:pPr>
+      <w:r>
+        <w:rPr>
+          <w:lang w:val="en-GB"/>
+        </w:rPr>
+        <w:t>    Cosine Weight:     10.0</w:t>
+      </w:r>
+    </w:p>
+    <w:p>
+      <w:pPr>
+        <w:rPr>
+          <w:lang w:val="en-GB"/>
+        </w:rPr>
+      </w:pPr>
+      <w:r>
+        <w:rPr>
+          <w:lang w:val="en-GB"/>
+        </w:rPr>
+        <w:t xml:space="preserve">    N_PAST = </w:t>
+      </w:r>
+      <w:r>
+        <w:rPr>
+          <w:lang w:val="en-GB"/>
+        </w:rPr>
+        <w:t>3</w:t>
+      </w:r>
+    </w:p>
+    <w:p>
+      <w:pPr>
+        <w:rPr>
+          <w:lang w:val="en-GB"/>
+        </w:rPr>
+      </w:pPr>
+    </w:p>
+    <w:p>
+      <w:pPr>
+        <w:rPr>
+          <w:lang w:val="en-GB"/>
+        </w:rPr>
+      </w:pPr>
+    </w:p>
+    <w:p>
+      <w:pPr>
+        <w:rPr>
+          <w:rFonts w:ascii="Segoe UI Emoji" w:hAnsi="Segoe UI Emoji" w:cs="Segoe UI Emoji"/>
+          <w:lang w:val="en-GB"/>
+        </w:rPr>
+      </w:pPr>
+    </w:p>
+    <w:p>
+      <w:pPr>
+        <w:rPr>
+          <w:rFonts w:ascii="Segoe UI Emoji" w:hAnsi="Segoe UI Emoji" w:cs="Segoe UI Emoji"/>
+          <w:lang w:val="en-GB"/>
+        </w:rPr>
+      </w:pPr>
+    </w:p>
+    <w:p>
+      <w:pPr>
+        <w:rPr>
+          <w:rFonts w:ascii="Segoe UI Emoji" w:hAnsi="Segoe UI Emoji" w:cs="Segoe UI Emoji"/>
+          <w:lang w:val="en-GB"/>
+        </w:rPr>
+      </w:pPr>
+    </w:p>
+    <w:p>
+      <w:pPr>
+        <w:rPr>
+          <w:rFonts w:ascii="Segoe UI Emoji" w:hAnsi="Segoe UI Emoji" w:cs="Segoe UI Emoji"/>
+          <w:lang w:val="en-GB"/>
+        </w:rPr>
+      </w:pPr>
+    </w:p>
+    <w:p>
+      <w:pPr>
+        <w:rPr>
+          <w:rFonts w:ascii="Segoe UI Emoji" w:hAnsi="Segoe UI Emoji" w:cs="Segoe UI Emoji"/>
+          <w:lang w:val="en-GB"/>
+        </w:rPr>
+      </w:pPr>
+    </w:p>
+    <w:p>
+      <w:r>
+        <w:rPr>
+          <w:rFonts w:ascii="Segoe UI Emoji" w:hAnsi="Segoe UI Emoji" w:cs="Segoe UI Emoji"/>
+          <w:lang w:val="en-GB"/>
         </w:rPr>
         <w:lastRenderedPageBreak/>
         <w:t>✅</w:t>
       </w:r>
       <w:r>
-        <w:t xml:space="preserve"> TUNING CNN COMPLETATO! Migliori Parametri</w:t>
-      </w:r>
-      <w:r>
-        <w:t xml:space="preserve"> CNN with MAE</w:t>
-      </w:r>
-      <w:r>
-        <w:t>:</w:t>
-      </w:r>
-    </w:p>
-    <w:p>
-      <w:pPr>
-        <w:rPr>
-          <w:lang w:val="en-GB"/>
-        </w:rPr>
-      </w:pPr>
-      <w:r>
-        <w:t xml:space="preserve">    </w:t>
-      </w:r>
-      <w:r>
-        <w:rPr>
-          <w:lang w:val="en-GB"/>
-        </w:rPr>
-        <w:t>---------------------------------------------</w:t>
-      </w:r>
-    </w:p>
-    <w:p>
-      <w:pPr>
-        <w:rPr>
-          <w:lang w:val="en-GB"/>
-        </w:rPr>
-      </w:pPr>
-      <w:r>
-        <w:rPr>
-          <w:lang w:val="en-GB"/>
-        </w:rPr>
-        <w:t>    Filters:           32</w:t>
-      </w:r>
-    </w:p>
-    <w:p>
-      <w:pPr>
-        <w:rPr>
-          <w:lang w:val="en-GB"/>
-        </w:rPr>
-      </w:pPr>
-      <w:r>
-        <w:rPr>
-          <w:lang w:val="en-GB"/>
-        </w:rPr>
-        <w:t>    Kernel Size:       2</w:t>
-      </w:r>
-    </w:p>
-    <w:p>
-      <w:pPr>
-        <w:rPr>
-          <w:lang w:val="en-GB"/>
-        </w:rPr>
-      </w:pPr>
-      <w:r>
-        <w:rPr>
-          <w:lang w:val="en-GB"/>
-        </w:rPr>
-        <w:t>    Second Layer?:     True</w:t>
-      </w:r>
-    </w:p>
-    <w:p>
-      <w:pPr>
-        <w:rPr>
-          <w:lang w:val="en-GB"/>
-        </w:rPr>
-      </w:pPr>
-      <w:r>
-        <w:rPr>
-          <w:lang w:val="en-GB"/>
-        </w:rPr>
-        <w:t>    Dense Context:     48</w:t>
-      </w:r>
-    </w:p>
-    <w:p>
-      <w:pPr>
-        <w:rPr>
-          <w:lang w:val="en-GB"/>
-        </w:rPr>
-      </w:pPr>
-      <w:r>
-        <w:rPr>
-          <w:lang w:val="en-GB"/>
-        </w:rPr>
-        <w:t>    Dense Final:       32</w:t>
-      </w:r>
-    </w:p>
-    <w:p>
-      <w:pPr>
-        <w:rPr>
-          <w:lang w:val="en-GB"/>
-        </w:rPr>
-      </w:pPr>
-      <w:r>
-        <w:rPr>
-          <w:lang w:val="en-GB"/>
-        </w:rPr>
-        <w:t>    Dropout Rate:      0.30000000000000004</w:t>
-      </w:r>
-    </w:p>
-    <w:p>
-      <w:pPr>
-        <w:rPr>
-          <w:lang w:val="en-GB"/>
-        </w:rPr>
-      </w:pPr>
-      <w:r>
-        <w:rPr>
-          <w:lang w:val="en-GB"/>
-        </w:rPr>
-        <w:t xml:space="preserve">    </w:t>
-      </w:r>
-      <w:r>
-        <w:rPr>
-          <w:lang w:val="en-GB"/>
-        </w:rPr>
-        <w:t>Learning Rate:     0.001</w:t>
-      </w:r>
-    </w:p>
-    <w:p>
-      <w:pPr>
-        <w:rPr>
-          <w:lang w:val="en-GB"/>
-        </w:rPr>
-      </w:pPr>
-      <w:r>
-        <w:rPr>
-          <w:lang w:val="en-GB"/>
-        </w:rPr>
-        <w:t>    Cosine Weight:     5.0</w:t>
-      </w:r>
-    </w:p>
-    <w:p>
-      <w:pPr>
-        <w:rPr>
-          <w:lang w:val="en-GB"/>
-        </w:rPr>
-      </w:pPr>
-      <w:r>
-        <w:rPr>
-          <w:lang w:val="en-GB"/>
-        </w:rPr>
-        <w:t xml:space="preserve">    N_PAST = 3</w:t>
-      </w:r>
-    </w:p>
-    <w:p>
-      <w:pPr>
-        <w:rPr>
-          <w:lang w:val="en-GB"/>
-        </w:rPr>
-      </w:pPr>
-    </w:p>
-    <w:p>
-      <w:r>
-        <w:rPr>
-          <w:rFonts w:ascii="Segoe UI Emoji" w:hAnsi="Segoe UI Emoji" w:cs="Segoe UI Emoji"/>
-        </w:rPr>
-        <w:t>✅</w:t>
-      </w:r>
-      <w:r>
-        <w:t xml:space="preserve"> TUNING CNN COMPLETATO! Migliori Parametri</w:t>
-      </w:r>
-      <w:r>
-        <w:t xml:space="preserve"> CNN with Custom Loss</w:t>
-      </w:r>
-      <w:r>
-        <w:t>:</w:t>
-      </w:r>
-    </w:p>
-    <w:p>
-      <w:pPr>
-        <w:rPr>
-          <w:lang w:val="en-GB"/>
-        </w:rPr>
-      </w:pPr>
-      <w:r>
-        <w:t xml:space="preserve">    </w:t>
-      </w:r>
-      <w:r>
-        <w:rPr>
-          <w:lang w:val="en-GB"/>
-        </w:rPr>
-        <w:t>---------------------------------------------</w:t>
-      </w:r>
-    </w:p>
-    <w:p>
-      <w:pPr>
-        <w:rPr>
-          <w:lang w:val="en-GB"/>
-        </w:rPr>
-      </w:pPr>
-      <w:r>
-        <w:rPr>
-          <w:lang w:val="en-GB"/>
-        </w:rPr>
-        <w:t>    Filters:           96</w:t>
-      </w:r>
-    </w:p>
-    <w:p>
-      <w:pPr>
-        <w:rPr>
-          <w:lang w:val="en-GB"/>
-        </w:rPr>
-      </w:pPr>
-      <w:r>
-        <w:rPr>
-          <w:lang w:val="en-GB"/>
-        </w:rPr>
-        <w:t>    Kernel Size:       3</w:t>
-      </w:r>
-    </w:p>
-    <w:p>
-      <w:pPr>
-        <w:rPr>
-          <w:lang w:val="en-GB"/>
-        </w:rPr>
-      </w:pPr>
-      <w:r>
-        <w:rPr>
-          <w:lang w:val="en-GB"/>
-        </w:rPr>
-        <w:t>    Second Layer?:     False</w:t>
-      </w:r>
-    </w:p>
-    <w:p>
-      <w:pPr>
-        <w:rPr>
-          <w:lang w:val="en-GB"/>
-        </w:rPr>
-      </w:pPr>
-      <w:r>
-        <w:rPr>
-          <w:lang w:val="en-GB"/>
-        </w:rPr>
-        <w:t>    Dense Context:     48</w:t>
-      </w:r>
-    </w:p>
-    <w:p>
-      <w:pPr>
-        <w:rPr>
-          <w:lang w:val="en-GB"/>
-        </w:rPr>
-      </w:pPr>
-      <w:r>
-        <w:rPr>
-          <w:lang w:val="en-GB"/>
-        </w:rPr>
-        <w:t>    Dense Final:       64</w:t>
-      </w:r>
-    </w:p>
-    <w:p>
-      <w:pPr>
-        <w:rPr>
-          <w:lang w:val="en-GB"/>
-        </w:rPr>
-      </w:pPr>
-      <w:r>
-        <w:rPr>
-          <w:lang w:val="en-GB"/>
-        </w:rPr>
-        <w:t>    Dropout Rate:      0.30000000000000004</w:t>
-      </w:r>
-    </w:p>
-    <w:p>
-      <w:pPr>
-        <w:rPr>
-          <w:lang w:val="en-GB"/>
-        </w:rPr>
-      </w:pPr>
-      <w:r>
-        <w:rPr>
-          <w:lang w:val="en-GB"/>
-        </w:rPr>
-        <w:t xml:space="preserve">    </w:t>
-      </w:r>
-      <w:r>
-        <w:rPr>
-          <w:lang w:val="en-GB"/>
-        </w:rPr>
-        <w:t>Learning Rate:     0.0005</w:t>
-      </w:r>
-    </w:p>
-    <w:p>
-      <w:pPr>
-        <w:rPr>
-          <w:lang w:val="en-GB"/>
-        </w:rPr>
-      </w:pPr>
-      <w:r>
-        <w:rPr>
-          <w:lang w:val="en-GB"/>
-        </w:rPr>
-        <w:t>    Cosine Weight:     10.0</w:t>
-      </w:r>
-    </w:p>
-    <w:p>
-      <w:pPr>
-        <w:rPr>
-          <w:lang w:val="en-GB"/>
-        </w:rPr>
-      </w:pPr>
-      <w:r>
-        <w:rPr>
-          <w:lang w:val="en-GB"/>
-        </w:rPr>
-        <w:t xml:space="preserve">    N_PAST = </w:t>
-      </w:r>
-      <w:r>
-        <w:rPr>
-          <w:lang w:val="en-GB"/>
-        </w:rPr>
-        <w:t>3</w:t>
-      </w:r>
-    </w:p>
-    <w:p>
-      <w:pPr>
-        <w:rPr>
-          <w:lang w:val="en-GB"/>
-        </w:rPr>
-      </w:pPr>
-    </w:p>
-    <w:p>
-      <w:pPr>
-        <w:rPr>
-          <w:lang w:val="en-GB"/>
-        </w:rPr>
-      </w:pPr>
-    </w:p>
-    <w:p>
-      <w:pPr>
-        <w:rPr>
-          <w:rFonts w:ascii="Segoe UI Emoji" w:hAnsi="Segoe UI Emoji" w:cs="Segoe UI Emoji"/>
-          <w:lang w:val="en-GB"/>
-        </w:rPr>
-      </w:pPr>
-    </w:p>
-    <w:p>
-      <w:pPr>
-        <w:rPr>
-          <w:rFonts w:ascii="Segoe UI Emoji" w:hAnsi="Segoe UI Emoji" w:cs="Segoe UI Emoji"/>
-          <w:lang w:val="en-GB"/>
-        </w:rPr>
-      </w:pPr>
-    </w:p>
-    <w:p>
-      <w:pPr>
-        <w:rPr>
-          <w:rFonts w:ascii="Segoe UI Emoji" w:hAnsi="Segoe UI Emoji" w:cs="Segoe UI Emoji"/>
-          <w:lang w:val="en-GB"/>
-        </w:rPr>
-      </w:pPr>
-    </w:p>
-    <w:p>
-      <w:pPr>
-        <w:rPr>
-          <w:rFonts w:ascii="Segoe UI Emoji" w:hAnsi="Segoe UI Emoji" w:cs="Segoe UI Emoji"/>
-          <w:lang w:val="en-GB"/>
-        </w:rPr>
-      </w:pPr>
-    </w:p>
-    <w:p>
-      <w:pPr>
-        <w:rPr>
-          <w:rFonts w:ascii="Segoe UI Emoji" w:hAnsi="Segoe UI Emoji" w:cs="Segoe UI Emoji"/>
-          <w:lang w:val="en-GB"/>
-        </w:rPr>
-      </w:pPr>
-    </w:p>
-    <w:p>
-      <w:pPr>
-        <w:rPr>
-          <w:rFonts w:ascii="Segoe UI Emoji" w:hAnsi="Segoe UI Emoji" w:cs="Segoe UI Emoji"/>
-          <w:lang w:val="en-GB"/>
-        </w:rPr>
-      </w:pPr>
-    </w:p>
-    <w:p>
-      <w:pPr>
-        <w:rPr>
-          <w:rFonts w:ascii="Segoe UI Emoji" w:hAnsi="Segoe UI Emoji" w:cs="Segoe UI Emoji"/>
-          <w:lang w:val="en-GB"/>
-        </w:rPr>
-      </w:pPr>
-    </w:p>
-    <w:p>
-      <w:pPr>
-        <w:rPr>
-          <w:rFonts w:ascii="Segoe UI Emoji" w:hAnsi="Segoe UI Emoji" w:cs="Segoe UI Emoji"/>
-          <w:lang w:val="en-GB"/>
-        </w:rPr>
-      </w:pPr>
-    </w:p>
-    <w:p>
-      <w:r>
-        <w:rPr>
-          <w:rFonts w:ascii="Segoe UI Emoji" w:hAnsi="Segoe UI Emoji" w:cs="Segoe UI Emoji"/>
-        </w:rPr>
-        <w:t>✅</w:t>
-      </w:r>
-      <w:r>
-        <w:t xml:space="preserve"> TUNING COMPLETATO! I Migliori Parametri </w:t>
+        <w:rPr>
+          <w:lang w:val="en-GB"/>
+        </w:rPr>
+        <w:t xml:space="preserve"> TUNING COMPLETATO! </w:t>
+      </w:r>
+      <w:r>
+        <w:t xml:space="preserve">I Migliori Parametri </w:t>
       </w:r>
       <w:r>
         <w:t>LSTM with MAE</w:t>
@@ -1419,7 +1423,7 @@
         <w:t>⚽</w:t>
       </w:r>
       <w:r>
-        <w:t xml:space="preserve"> Media Punti AI (Reali):                 </w:t>
+        <w:t xml:space="preserve"> Media Punti AI (Reali): </w:t>
       </w:r>
       <w:r>
         <w:t>64</w:t>
@@ -1437,7 +1441,7 @@
         <w:t>🔮</w:t>
       </w:r>
       <w:r>
-        <w:t xml:space="preserve"> Media Punti Ottimali (Perfetti):        </w:t>
+        <w:t xml:space="preserve"> Media Punti Ottimali (Perfetti): </w:t>
       </w:r>
       <w:r>
         <w:t>71</w:t>
@@ -1454,7 +1458,7 @@
         <w:t>⚡</w:t>
       </w:r>
       <w:r>
-        <w:t xml:space="preserve"> Efficienza (Punti AI / Punti Max):      </w:t>
+        <w:t xml:space="preserve"> Efficienza (Punti AI / Punti Max): </w:t>
       </w:r>
       <w:r>
         <w:t>90.57</w:t>
@@ -1465,6 +1469,2108 @@
     </w:p>
     <w:p/>
     <w:p/>
+    <w:p/>
+    <w:p>
+      <w:r>
+        <w:lastRenderedPageBreak/>
+        <w:t xml:space="preserve">DIFENSORI </w:t>
+      </w:r>
+    </w:p>
+    <w:p>
+      <w:r>
+        <w:t>(14300 training, 3300 validation, 3200 testing)</w:t>
+      </w:r>
+    </w:p>
+    <w:p>
+      <w:r>
+        <w:rPr>
+          <w:rFonts w:ascii="Segoe UI Emoji" w:hAnsi="Segoe UI Emoji" w:cs="Segoe UI Emoji"/>
+        </w:rPr>
+        <w:t>✅</w:t>
+      </w:r>
+      <w:r>
+        <w:t xml:space="preserve"> TUNING COMPLETATO! I Migliori Parametri sono LSTM with Custom Loss:</w:t>
+      </w:r>
+    </w:p>
+    <w:p>
+      <w:pPr>
+        <w:rPr>
+          <w:lang w:val="en-GB"/>
+        </w:rPr>
+      </w:pPr>
+      <w:r>
+        <w:t xml:space="preserve">    </w:t>
+      </w:r>
+      <w:r>
+        <w:rPr>
+          <w:lang w:val="en-GB"/>
+        </w:rPr>
+        <w:t>------------------------------------------------</w:t>
+      </w:r>
+    </w:p>
+    <w:p>
+      <w:pPr>
+        <w:rPr>
+          <w:lang w:val="en-GB"/>
+        </w:rPr>
+      </w:pPr>
+      <w:r>
+        <w:rPr>
+          <w:lang w:val="en-GB"/>
+        </w:rPr>
+        <w:t xml:space="preserve">    LSTM Units:        96</w:t>
+      </w:r>
+    </w:p>
+    <w:p>
+      <w:pPr>
+        <w:rPr>
+          <w:lang w:val="en-GB"/>
+        </w:rPr>
+      </w:pPr>
+      <w:r>
+        <w:rPr>
+          <w:lang w:val="en-GB"/>
+        </w:rPr>
+        <w:t xml:space="preserve">    Dense Context:     32</w:t>
+      </w:r>
+    </w:p>
+    <w:p>
+      <w:pPr>
+        <w:rPr>
+          <w:lang w:val="en-GB"/>
+        </w:rPr>
+      </w:pPr>
+      <w:r>
+        <w:rPr>
+          <w:lang w:val="en-GB"/>
+        </w:rPr>
+        <w:t xml:space="preserve">    Dense Final:       32</w:t>
+      </w:r>
+    </w:p>
+    <w:p>
+      <w:pPr>
+        <w:rPr>
+          <w:lang w:val="en-GB"/>
+        </w:rPr>
+      </w:pPr>
+      <w:r>
+        <w:rPr>
+          <w:lang w:val="en-GB"/>
+        </w:rPr>
+        <w:t xml:space="preserve">    Extra Layer?:      True</w:t>
+      </w:r>
+    </w:p>
+    <w:p>
+      <w:pPr>
+        <w:rPr>
+          <w:lang w:val="en-GB"/>
+        </w:rPr>
+      </w:pPr>
+      <w:r>
+        <w:rPr>
+          <w:lang w:val="en-GB"/>
+        </w:rPr>
+        <w:t xml:space="preserve">    Dropout Rate:      0.1</w:t>
+      </w:r>
+    </w:p>
+    <w:p>
+      <w:pPr>
+        <w:rPr>
+          <w:lang w:val="en-GB"/>
+        </w:rPr>
+      </w:pPr>
+      <w:r>
+        <w:rPr>
+          <w:lang w:val="en-GB"/>
+        </w:rPr>
+        <w:t xml:space="preserve">    Learning Rate:     0.001</w:t>
+      </w:r>
+    </w:p>
+    <w:p>
+      <w:pPr>
+        <w:rPr>
+          <w:lang w:val="en-GB"/>
+        </w:rPr>
+      </w:pPr>
+      <w:r>
+        <w:rPr>
+          <w:lang w:val="en-GB"/>
+        </w:rPr>
+        <w:t xml:space="preserve">    Loss Cosine Wgt:   10.0</w:t>
+      </w:r>
+    </w:p>
+    <w:p>
+      <w:pPr>
+        <w:rPr>
+          <w:lang w:val="en-GB"/>
+        </w:rPr>
+      </w:pPr>
+      <w:r>
+        <w:rPr>
+          <w:lang w:val="en-GB"/>
+        </w:rPr>
+        <w:t xml:space="preserve">    N_PAST :</w:t>
+      </w:r>
+      <w:r>
+        <w:rPr>
+          <w:lang w:val="en-GB"/>
+        </w:rPr>
+        <w:t xml:space="preserve"> 4</w:t>
+      </w:r>
+    </w:p>
+    <w:p>
+      <w:pPr>
+        <w:rPr>
+          <w:lang w:val="en-GB"/>
+        </w:rPr>
+      </w:pPr>
+    </w:p>
+    <w:p>
+      <w:pPr>
+        <w:rPr>
+          <w:lang w:val="en-GB"/>
+        </w:rPr>
+      </w:pPr>
+    </w:p>
+    <w:p>
+      <w:r>
+        <w:rPr>
+          <w:rFonts w:ascii="Segoe UI Emoji" w:hAnsi="Segoe UI Emoji" w:cs="Segoe UI Emoji"/>
+        </w:rPr>
+        <w:t>✅</w:t>
+      </w:r>
+      <w:r>
+        <w:t xml:space="preserve"> TUNING COMPLETATO! I Migliori Parametri sono</w:t>
+      </w:r>
+      <w:r>
+        <w:t xml:space="preserve"> LSTM with MAE</w:t>
+      </w:r>
+      <w:r>
+        <w:t>:</w:t>
+      </w:r>
+    </w:p>
+    <w:p>
+      <w:pPr>
+        <w:rPr>
+          <w:lang w:val="en-GB"/>
+        </w:rPr>
+      </w:pPr>
+      <w:r>
+        <w:t xml:space="preserve">    </w:t>
+      </w:r>
+      <w:r>
+        <w:rPr>
+          <w:lang w:val="en-GB"/>
+        </w:rPr>
+        <w:t>------------------------------------------------</w:t>
+      </w:r>
+    </w:p>
+    <w:p>
+      <w:pPr>
+        <w:rPr>
+          <w:lang w:val="en-GB"/>
+        </w:rPr>
+      </w:pPr>
+      <w:r>
+        <w:rPr>
+          <w:lang w:val="en-GB"/>
+        </w:rPr>
+        <w:t xml:space="preserve">    LSTM Units:        32</w:t>
+      </w:r>
+    </w:p>
+    <w:p>
+      <w:pPr>
+        <w:rPr>
+          <w:lang w:val="en-GB"/>
+        </w:rPr>
+      </w:pPr>
+      <w:r>
+        <w:rPr>
+          <w:lang w:val="en-GB"/>
+        </w:rPr>
+        <w:t xml:space="preserve">    Dense Context:     32</w:t>
+      </w:r>
+    </w:p>
+    <w:p>
+      <w:pPr>
+        <w:rPr>
+          <w:lang w:val="en-GB"/>
+        </w:rPr>
+      </w:pPr>
+      <w:r>
+        <w:rPr>
+          <w:lang w:val="en-GB"/>
+        </w:rPr>
+        <w:t xml:space="preserve">    Dense Final:       128</w:t>
+      </w:r>
+    </w:p>
+    <w:p>
+      <w:pPr>
+        <w:rPr>
+          <w:lang w:val="en-GB"/>
+        </w:rPr>
+      </w:pPr>
+      <w:r>
+        <w:rPr>
+          <w:lang w:val="en-GB"/>
+        </w:rPr>
+        <w:t xml:space="preserve">    Extra Layer?:      True</w:t>
+      </w:r>
+    </w:p>
+    <w:p>
+      <w:pPr>
+        <w:rPr>
+          <w:lang w:val="en-GB"/>
+        </w:rPr>
+      </w:pPr>
+      <w:r>
+        <w:rPr>
+          <w:lang w:val="en-GB"/>
+        </w:rPr>
+        <w:t xml:space="preserve">    Dropout Rate:      0.2</w:t>
+      </w:r>
+    </w:p>
+    <w:p>
+      <w:pPr>
+        <w:rPr>
+          <w:lang w:val="en-GB"/>
+        </w:rPr>
+      </w:pPr>
+      <w:r>
+        <w:rPr>
+          <w:lang w:val="en-GB"/>
+        </w:rPr>
+        <w:t xml:space="preserve">    Learning Rate:     0.001</w:t>
+      </w:r>
+    </w:p>
+    <w:p>
+      <w:pPr>
+        <w:rPr>
+          <w:lang w:val="en-GB"/>
+        </w:rPr>
+      </w:pPr>
+      <w:r>
+        <w:rPr>
+          <w:lang w:val="en-GB"/>
+        </w:rPr>
+        <w:t xml:space="preserve">    Loss Cosine Wgt:   3.0</w:t>
+      </w:r>
+    </w:p>
+    <w:p>
+      <w:pPr>
+        <w:rPr>
+          <w:lang w:val="en-GB"/>
+        </w:rPr>
+      </w:pPr>
+      <w:r>
+        <w:rPr>
+          <w:lang w:val="en-GB"/>
+        </w:rPr>
+        <w:t xml:space="preserve">    N_PAST :</w:t>
+      </w:r>
+      <w:r>
+        <w:rPr>
+          <w:lang w:val="en-GB"/>
+        </w:rPr>
+        <w:t xml:space="preserve"> 6</w:t>
+      </w:r>
+    </w:p>
+    <w:p>
+      <w:pPr>
+        <w:rPr>
+          <w:lang w:val="en-GB"/>
+        </w:rPr>
+      </w:pPr>
+    </w:p>
+    <w:p>
+      <w:pPr>
+        <w:rPr>
+          <w:lang w:val="en-GB"/>
+        </w:rPr>
+      </w:pPr>
+    </w:p>
+    <w:p>
+      <w:r>
+        <w:rPr>
+          <w:rFonts w:ascii="Segoe UI Emoji" w:hAnsi="Segoe UI Emoji" w:cs="Segoe UI Emoji"/>
+        </w:rPr>
+        <w:t>✅</w:t>
+      </w:r>
+      <w:r>
+        <w:t xml:space="preserve"> TUNING CNN COMPLETATO! Migliori Parametri</w:t>
+      </w:r>
+      <w:r>
+        <w:t xml:space="preserve"> CNN MAE</w:t>
+      </w:r>
+      <w:r>
+        <w:t>:</w:t>
+      </w:r>
+    </w:p>
+    <w:p>
+      <w:pPr>
+        <w:rPr>
+          <w:lang w:val="en-GB"/>
+        </w:rPr>
+      </w:pPr>
+      <w:r>
+        <w:t xml:space="preserve">    </w:t>
+      </w:r>
+      <w:r>
+        <w:rPr>
+          <w:lang w:val="en-GB"/>
+        </w:rPr>
+        <w:t>---------------------------------------------</w:t>
+      </w:r>
+    </w:p>
+    <w:p>
+      <w:pPr>
+        <w:rPr>
+          <w:lang w:val="en-GB"/>
+        </w:rPr>
+      </w:pPr>
+      <w:r>
+        <w:rPr>
+          <w:lang w:val="en-GB"/>
+        </w:rPr>
+        <w:t xml:space="preserve">    Filters:           64</w:t>
+      </w:r>
+    </w:p>
+    <w:p>
+      <w:pPr>
+        <w:rPr>
+          <w:lang w:val="en-GB"/>
+        </w:rPr>
+      </w:pPr>
+      <w:r>
+        <w:rPr>
+          <w:lang w:val="en-GB"/>
+        </w:rPr>
+        <w:t xml:space="preserve">    Kernel Size:       2</w:t>
+      </w:r>
+    </w:p>
+    <w:p>
+      <w:pPr>
+        <w:rPr>
+          <w:lang w:val="en-GB"/>
+        </w:rPr>
+      </w:pPr>
+      <w:r>
+        <w:rPr>
+          <w:lang w:val="en-GB"/>
+        </w:rPr>
+        <w:t xml:space="preserve">    Second Layer?:     False</w:t>
+      </w:r>
+    </w:p>
+    <w:p>
+      <w:pPr>
+        <w:rPr>
+          <w:lang w:val="en-GB"/>
+        </w:rPr>
+      </w:pPr>
+      <w:r>
+        <w:rPr>
+          <w:lang w:val="en-GB"/>
+        </w:rPr>
+        <w:lastRenderedPageBreak/>
+        <w:t xml:space="preserve">    Dense Context:     32</w:t>
+      </w:r>
+    </w:p>
+    <w:p>
+      <w:pPr>
+        <w:rPr>
+          <w:lang w:val="en-GB"/>
+        </w:rPr>
+      </w:pPr>
+      <w:r>
+        <w:rPr>
+          <w:lang w:val="en-GB"/>
+        </w:rPr>
+        <w:t xml:space="preserve">    Dense Final:       64</w:t>
+      </w:r>
+    </w:p>
+    <w:p>
+      <w:pPr>
+        <w:rPr>
+          <w:lang w:val="en-GB"/>
+        </w:rPr>
+      </w:pPr>
+      <w:r>
+        <w:rPr>
+          <w:lang w:val="en-GB"/>
+        </w:rPr>
+        <w:t xml:space="preserve">    Dropout Rate:      0.4</w:t>
+      </w:r>
+    </w:p>
+    <w:p>
+      <w:pPr>
+        <w:rPr>
+          <w:lang w:val="en-GB"/>
+        </w:rPr>
+      </w:pPr>
+      <w:r>
+        <w:rPr>
+          <w:lang w:val="en-GB"/>
+        </w:rPr>
+        <w:t xml:space="preserve">    Learning Rate:     0.001</w:t>
+      </w:r>
+    </w:p>
+    <w:p>
+      <w:pPr>
+        <w:rPr>
+          <w:lang w:val="en-GB"/>
+        </w:rPr>
+      </w:pPr>
+      <w:r>
+        <w:rPr>
+          <w:lang w:val="en-GB"/>
+        </w:rPr>
+        <w:t xml:space="preserve">    Cosine Weight:     5.0</w:t>
+      </w:r>
+    </w:p>
+    <w:p>
+      <w:pPr>
+        <w:rPr>
+          <w:lang w:val="en-GB"/>
+        </w:rPr>
+      </w:pPr>
+      <w:r>
+        <w:rPr>
+          <w:lang w:val="en-GB"/>
+        </w:rPr>
+        <w:t xml:space="preserve">    </w:t>
+      </w:r>
+      <w:r>
+        <w:rPr>
+          <w:lang w:val="en-GB"/>
+        </w:rPr>
+        <w:t>N_PAST : 2</w:t>
+      </w:r>
+    </w:p>
+    <w:p>
+      <w:pPr>
+        <w:rPr>
+          <w:lang w:val="en-GB"/>
+        </w:rPr>
+      </w:pPr>
+    </w:p>
+    <w:p>
+      <w:pPr>
+        <w:rPr>
+          <w:lang w:val="en-GB"/>
+        </w:rPr>
+      </w:pPr>
+    </w:p>
+    <w:p>
+      <w:r>
+        <w:rPr>
+          <w:rFonts w:ascii="Segoe UI Emoji" w:hAnsi="Segoe UI Emoji" w:cs="Segoe UI Emoji"/>
+          <w:lang w:val="en-GB"/>
+        </w:rPr>
+        <w:t>✅</w:t>
+      </w:r>
+      <w:r>
+        <w:rPr>
+          <w:lang w:val="en-GB"/>
+        </w:rPr>
+        <w:t xml:space="preserve"> TUNING CNN COMPLETATO! </w:t>
+      </w:r>
+      <w:r>
+        <w:t>Migliori Parametri</w:t>
+      </w:r>
+      <w:r>
+        <w:t xml:space="preserve"> CNN Custom Loss</w:t>
+      </w:r>
+      <w:r>
+        <w:t>:</w:t>
+      </w:r>
+    </w:p>
+    <w:p>
+      <w:pPr>
+        <w:rPr>
+          <w:lang w:val="en-GB"/>
+        </w:rPr>
+      </w:pPr>
+      <w:r>
+        <w:t xml:space="preserve">    </w:t>
+      </w:r>
+      <w:r>
+        <w:rPr>
+          <w:lang w:val="en-GB"/>
+        </w:rPr>
+        <w:t>---------------------------------------------</w:t>
+      </w:r>
+    </w:p>
+    <w:p>
+      <w:pPr>
+        <w:rPr>
+          <w:lang w:val="en-GB"/>
+        </w:rPr>
+      </w:pPr>
+      <w:r>
+        <w:rPr>
+          <w:lang w:val="en-GB"/>
+        </w:rPr>
+        <w:t xml:space="preserve">    Filters:           96</w:t>
+      </w:r>
+    </w:p>
+    <w:p>
+      <w:pPr>
+        <w:rPr>
+          <w:lang w:val="en-GB"/>
+        </w:rPr>
+      </w:pPr>
+      <w:r>
+        <w:rPr>
+          <w:lang w:val="en-GB"/>
+        </w:rPr>
+        <w:t xml:space="preserve">    Kernel Size:       3</w:t>
+      </w:r>
+    </w:p>
+    <w:p>
+      <w:pPr>
+        <w:rPr>
+          <w:lang w:val="en-GB"/>
+        </w:rPr>
+      </w:pPr>
+      <w:r>
+        <w:rPr>
+          <w:lang w:val="en-GB"/>
+        </w:rPr>
+        <w:t xml:space="preserve">    Second Layer?:     False</w:t>
+      </w:r>
+    </w:p>
+    <w:p>
+      <w:pPr>
+        <w:rPr>
+          <w:lang w:val="en-GB"/>
+        </w:rPr>
+      </w:pPr>
+      <w:r>
+        <w:rPr>
+          <w:lang w:val="en-GB"/>
+        </w:rPr>
+        <w:t xml:space="preserve">    Dense Context:     16</w:t>
+      </w:r>
+    </w:p>
+    <w:p>
+      <w:pPr>
+        <w:rPr>
+          <w:lang w:val="en-GB"/>
+        </w:rPr>
+      </w:pPr>
+      <w:r>
+        <w:rPr>
+          <w:lang w:val="en-GB"/>
+        </w:rPr>
+        <w:t xml:space="preserve">    Dense Final:       96</w:t>
+      </w:r>
+    </w:p>
+    <w:p>
+      <w:pPr>
+        <w:rPr>
+          <w:lang w:val="en-GB"/>
+        </w:rPr>
+      </w:pPr>
+      <w:r>
+        <w:rPr>
+          <w:lang w:val="en-GB"/>
+        </w:rPr>
+        <w:t xml:space="preserve">    Dropout Rate:      0.30000000000000004</w:t>
+      </w:r>
+    </w:p>
+    <w:p>
+      <w:pPr>
+        <w:rPr>
+          <w:lang w:val="en-GB"/>
+        </w:rPr>
+      </w:pPr>
+      <w:r>
+        <w:rPr>
+          <w:lang w:val="en-GB"/>
+        </w:rPr>
+        <w:t xml:space="preserve">    Learning Rate:     0.0005</w:t>
+      </w:r>
+    </w:p>
+    <w:p>
+      <w:pPr>
+        <w:rPr>
+          <w:lang w:val="en-GB"/>
+        </w:rPr>
+      </w:pPr>
+      <w:r>
+        <w:rPr>
+          <w:lang w:val="en-GB"/>
+        </w:rPr>
+        <w:t xml:space="preserve">    Cosine Weight:     12.0</w:t>
+      </w:r>
+    </w:p>
+    <w:p>
+      <w:pPr>
+        <w:rPr>
+          <w:lang w:val="en-GB"/>
+        </w:rPr>
+      </w:pPr>
+      <w:r>
+        <w:rPr>
+          <w:lang w:val="en-GB"/>
+        </w:rPr>
+        <w:t xml:space="preserve">    N_PAST = 3</w:t>
+      </w:r>
+    </w:p>
+    <w:p>
+      <w:pPr>
+        <w:rPr>
+          <w:lang w:val="en-GB"/>
+        </w:rPr>
+      </w:pPr>
+    </w:p>
+    <w:p>
+      <w:pPr>
+        <w:rPr>
+          <w:lang w:val="en-GB"/>
+        </w:rPr>
+      </w:pPr>
+    </w:p>
+    <w:p>
+      <w:pPr>
+        <w:rPr>
+          <w:lang w:val="en-GB"/>
+        </w:rPr>
+      </w:pPr>
+    </w:p>
+    <w:p>
+      <w:pPr>
+        <w:rPr>
+          <w:lang w:val="en-GB"/>
+        </w:rPr>
+      </w:pPr>
+    </w:p>
+    <w:p>
+      <w:pPr>
+        <w:rPr>
+          <w:lang w:val="en-GB"/>
+        </w:rPr>
+      </w:pPr>
+    </w:p>
+    <w:p>
+      <w:pPr>
+        <w:rPr>
+          <w:lang w:val="en-GB"/>
+        </w:rPr>
+      </w:pPr>
+    </w:p>
+    <w:p>
+      <w:pPr>
+        <w:rPr>
+          <w:lang w:val="en-GB"/>
+        </w:rPr>
+      </w:pPr>
+    </w:p>
+    <w:p>
+      <w:pPr>
+        <w:rPr>
+          <w:lang w:val="en-GB"/>
+        </w:rPr>
+      </w:pPr>
+    </w:p>
+    <w:p>
+      <w:pPr>
+        <w:rPr>
+          <w:lang w:val="en-GB"/>
+        </w:rPr>
+      </w:pPr>
+    </w:p>
+    <w:p>
+      <w:pPr>
+        <w:rPr>
+          <w:lang w:val="en-GB"/>
+        </w:rPr>
+      </w:pPr>
+    </w:p>
+    <w:p>
+      <w:pPr>
+        <w:rPr>
+          <w:lang w:val="en-GB"/>
+        </w:rPr>
+      </w:pPr>
+    </w:p>
+    <w:p>
+      <w:pPr>
+        <w:rPr>
+          <w:lang w:val="en-GB"/>
+        </w:rPr>
+      </w:pPr>
+    </w:p>
+    <w:p>
+      <w:pPr>
+        <w:rPr>
+          <w:lang w:val="en-GB"/>
+        </w:rPr>
+      </w:pPr>
+    </w:p>
+    <w:p>
+      <w:pPr>
+        <w:rPr>
+          <w:lang w:val="en-GB"/>
+        </w:rPr>
+      </w:pPr>
+      <w:r>
+        <w:rPr>
+          <w:lang w:val="en-GB"/>
+        </w:rPr>
+        <w:lastRenderedPageBreak/>
+        <w:t>CENTROCAMPISTI:</w:t>
+      </w:r>
+    </w:p>
+    <w:p>
+      <w:r>
+        <w:t>(circa 15</w:t>
+      </w:r>
+      <w:r>
+        <w:t>3</w:t>
+      </w:r>
+      <w:r>
+        <w:t>00 per il training, 3</w:t>
+      </w:r>
+      <w:r>
+        <w:t>300 per validation, 3300 per testing)</w:t>
+      </w:r>
+    </w:p>
+    <w:p/>
+    <w:p>
+      <w:r>
+        <w:rPr>
+          <w:rFonts w:ascii="Segoe UI Emoji" w:hAnsi="Segoe UI Emoji" w:cs="Segoe UI Emoji"/>
+        </w:rPr>
+        <w:t>✅</w:t>
+      </w:r>
+      <w:r>
+        <w:t xml:space="preserve"> TUNING COMPLETATO! I Migliori Parametri sono</w:t>
+      </w:r>
+      <w:r>
+        <w:t xml:space="preserve"> LSTM MAE</w:t>
+      </w:r>
+      <w:r>
+        <w:t>:</w:t>
+      </w:r>
+    </w:p>
+    <w:p>
+      <w:pPr>
+        <w:rPr>
+          <w:lang w:val="en-GB"/>
+        </w:rPr>
+      </w:pPr>
+      <w:r>
+        <w:t xml:space="preserve">    </w:t>
+      </w:r>
+      <w:r>
+        <w:rPr>
+          <w:lang w:val="en-GB"/>
+        </w:rPr>
+        <w:t>------------------------------------------------</w:t>
+      </w:r>
+    </w:p>
+    <w:p>
+      <w:pPr>
+        <w:rPr>
+          <w:lang w:val="en-GB"/>
+        </w:rPr>
+      </w:pPr>
+      <w:r>
+        <w:rPr>
+          <w:lang w:val="en-GB"/>
+        </w:rPr>
+        <w:t xml:space="preserve">    LSTM Units:        32</w:t>
+      </w:r>
+    </w:p>
+    <w:p>
+      <w:pPr>
+        <w:rPr>
+          <w:lang w:val="en-GB"/>
+        </w:rPr>
+      </w:pPr>
+      <w:r>
+        <w:rPr>
+          <w:lang w:val="en-GB"/>
+        </w:rPr>
+        <w:t xml:space="preserve">    Dense Context:     48</w:t>
+      </w:r>
+    </w:p>
+    <w:p>
+      <w:pPr>
+        <w:rPr>
+          <w:lang w:val="en-GB"/>
+        </w:rPr>
+      </w:pPr>
+      <w:r>
+        <w:rPr>
+          <w:lang w:val="en-GB"/>
+        </w:rPr>
+        <w:t xml:space="preserve">    Dense Final:       32</w:t>
+      </w:r>
+    </w:p>
+    <w:p>
+      <w:pPr>
+        <w:rPr>
+          <w:lang w:val="en-GB"/>
+        </w:rPr>
+      </w:pPr>
+      <w:r>
+        <w:rPr>
+          <w:lang w:val="en-GB"/>
+        </w:rPr>
+        <w:t xml:space="preserve">    Extra Layer?:      True</w:t>
+      </w:r>
+    </w:p>
+    <w:p>
+      <w:pPr>
+        <w:rPr>
+          <w:lang w:val="en-GB"/>
+        </w:rPr>
+      </w:pPr>
+      <w:r>
+        <w:rPr>
+          <w:lang w:val="en-GB"/>
+        </w:rPr>
+        <w:t xml:space="preserve">    Dropout Rate:      0.1</w:t>
+      </w:r>
+    </w:p>
+    <w:p>
+      <w:pPr>
+        <w:rPr>
+          <w:lang w:val="en-GB"/>
+        </w:rPr>
+      </w:pPr>
+      <w:r>
+        <w:rPr>
+          <w:lang w:val="en-GB"/>
+        </w:rPr>
+        <w:t xml:space="preserve">    Learning Rate:     0.001</w:t>
+      </w:r>
+    </w:p>
+    <w:p>
+      <w:pPr>
+        <w:rPr>
+          <w:lang w:val="en-GB"/>
+        </w:rPr>
+      </w:pPr>
+      <w:r>
+        <w:rPr>
+          <w:lang w:val="en-GB"/>
+        </w:rPr>
+        <w:t xml:space="preserve">    Loss Cosine Wgt:   5.0</w:t>
+      </w:r>
+    </w:p>
+    <w:p>
+      <w:pPr>
+        <w:rPr>
+          <w:lang w:val="en-GB"/>
+        </w:rPr>
+      </w:pPr>
+      <w:r>
+        <w:rPr>
+          <w:lang w:val="en-GB"/>
+        </w:rPr>
+        <w:t xml:space="preserve">    N_PAST : 2</w:t>
+      </w:r>
+    </w:p>
+    <w:p>
+      <w:pPr>
+        <w:rPr>
+          <w:lang w:val="en-GB"/>
+        </w:rPr>
+      </w:pPr>
+    </w:p>
+    <w:p>
+      <w:pPr>
+        <w:rPr>
+          <w:lang w:val="en-GB"/>
+        </w:rPr>
+      </w:pPr>
+    </w:p>
+    <w:p>
+      <w:r>
+        <w:rPr>
+          <w:rFonts w:ascii="Segoe UI Emoji" w:hAnsi="Segoe UI Emoji" w:cs="Segoe UI Emoji"/>
+        </w:rPr>
+        <w:t>✅</w:t>
+      </w:r>
+      <w:r>
+        <w:t xml:space="preserve"> TUNING COMPLETATO! I Migliori Parametri sono</w:t>
+      </w:r>
+      <w:r>
+        <w:t xml:space="preserve"> LSTM Custom Loss</w:t>
+      </w:r>
+      <w:r>
+        <w:t>:</w:t>
+      </w:r>
+    </w:p>
+    <w:p>
+      <w:pPr>
+        <w:rPr>
+          <w:lang w:val="en-GB"/>
+        </w:rPr>
+      </w:pPr>
+      <w:r>
+        <w:t xml:space="preserve">    </w:t>
+      </w:r>
+      <w:r>
+        <w:rPr>
+          <w:lang w:val="en-GB"/>
+        </w:rPr>
+        <w:t>------------------------------------------------</w:t>
+      </w:r>
+    </w:p>
+    <w:p>
+      <w:pPr>
+        <w:rPr>
+          <w:lang w:val="en-GB"/>
+        </w:rPr>
+      </w:pPr>
+      <w:r>
+        <w:rPr>
+          <w:lang w:val="en-GB"/>
+        </w:rPr>
+        <w:t xml:space="preserve">    LSTM Units:        96</w:t>
+      </w:r>
+    </w:p>
+    <w:p>
+      <w:pPr>
+        <w:rPr>
+          <w:lang w:val="en-GB"/>
+        </w:rPr>
+      </w:pPr>
+      <w:r>
+        <w:rPr>
+          <w:lang w:val="en-GB"/>
+        </w:rPr>
+        <w:t xml:space="preserve">    Dense Context:     16</w:t>
+      </w:r>
+    </w:p>
+    <w:p>
+      <w:pPr>
+        <w:rPr>
+          <w:lang w:val="en-GB"/>
+        </w:rPr>
+      </w:pPr>
+      <w:r>
+        <w:rPr>
+          <w:lang w:val="en-GB"/>
+        </w:rPr>
+        <w:t xml:space="preserve">    Dense Final:       96</w:t>
+      </w:r>
+    </w:p>
+    <w:p>
+      <w:pPr>
+        <w:rPr>
+          <w:lang w:val="en-GB"/>
+        </w:rPr>
+      </w:pPr>
+      <w:r>
+        <w:rPr>
+          <w:lang w:val="en-GB"/>
+        </w:rPr>
+        <w:t xml:space="preserve">    Extra Layer?:      True</w:t>
+      </w:r>
+    </w:p>
+    <w:p>
+      <w:pPr>
+        <w:rPr>
+          <w:lang w:val="en-GB"/>
+        </w:rPr>
+      </w:pPr>
+      <w:r>
+        <w:rPr>
+          <w:lang w:val="en-GB"/>
+        </w:rPr>
+        <w:t xml:space="preserve">    Dropout Rate:      0.30000000000000004</w:t>
+      </w:r>
+    </w:p>
+    <w:p>
+      <w:pPr>
+        <w:rPr>
+          <w:lang w:val="en-GB"/>
+        </w:rPr>
+      </w:pPr>
+      <w:r>
+        <w:rPr>
+          <w:lang w:val="en-GB"/>
+        </w:rPr>
+        <w:t xml:space="preserve">    Learning Rate:     0.001</w:t>
+      </w:r>
+    </w:p>
+    <w:p>
+      <w:pPr>
+        <w:rPr>
+          <w:lang w:val="en-GB"/>
+        </w:rPr>
+      </w:pPr>
+      <w:r>
+        <w:rPr>
+          <w:lang w:val="en-GB"/>
+        </w:rPr>
+        <w:t xml:space="preserve">    Loss Cosine Wgt:   10.0</w:t>
+      </w:r>
+    </w:p>
+    <w:p>
+      <w:pPr>
+        <w:rPr>
+          <w:lang w:val="en-GB"/>
+        </w:rPr>
+      </w:pPr>
+      <w:r>
+        <w:rPr>
+          <w:lang w:val="en-GB"/>
+        </w:rPr>
+        <w:t xml:space="preserve">    N_PAST : 5</w:t>
+      </w:r>
+    </w:p>
+    <w:p>
+      <w:pPr>
+        <w:rPr>
+          <w:lang w:val="en-GB"/>
+        </w:rPr>
+      </w:pPr>
+    </w:p>
+    <w:p>
+      <w:pPr>
+        <w:rPr>
+          <w:lang w:val="en-GB"/>
+        </w:rPr>
+      </w:pPr>
+    </w:p>
+    <w:p>
+      <w:pPr>
+        <w:rPr>
+          <w:rFonts w:ascii="Segoe UI Emoji" w:hAnsi="Segoe UI Emoji" w:cs="Segoe UI Emoji"/>
+        </w:rPr>
+      </w:pPr>
+    </w:p>
+    <w:p>
+      <w:pPr>
+        <w:rPr>
+          <w:rFonts w:ascii="Segoe UI Emoji" w:hAnsi="Segoe UI Emoji" w:cs="Segoe UI Emoji"/>
+        </w:rPr>
+      </w:pPr>
+    </w:p>
+    <w:p>
+      <w:pPr>
+        <w:rPr>
+          <w:rFonts w:ascii="Segoe UI Emoji" w:hAnsi="Segoe UI Emoji" w:cs="Segoe UI Emoji"/>
+        </w:rPr>
+      </w:pPr>
+    </w:p>
+    <w:p>
+      <w:pPr>
+        <w:rPr>
+          <w:rFonts w:ascii="Segoe UI Emoji" w:hAnsi="Segoe UI Emoji" w:cs="Segoe UI Emoji"/>
+        </w:rPr>
+      </w:pPr>
+    </w:p>
+    <w:p>
+      <w:r>
+        <w:rPr>
+          <w:rFonts w:ascii="Segoe UI Emoji" w:hAnsi="Segoe UI Emoji" w:cs="Segoe UI Emoji"/>
+        </w:rPr>
+        <w:lastRenderedPageBreak/>
+        <w:t>✅</w:t>
+      </w:r>
+      <w:r>
+        <w:t xml:space="preserve"> TUNING CNN COMPLETATO! Migliori Parametri</w:t>
+      </w:r>
+      <w:r>
+        <w:t xml:space="preserve"> MAE</w:t>
+      </w:r>
+      <w:r>
+        <w:t>:</w:t>
+      </w:r>
+    </w:p>
+    <w:p>
+      <w:pPr>
+        <w:rPr>
+          <w:lang w:val="en-GB"/>
+        </w:rPr>
+      </w:pPr>
+      <w:r>
+        <w:t xml:space="preserve">    </w:t>
+      </w:r>
+      <w:r>
+        <w:rPr>
+          <w:lang w:val="en-GB"/>
+        </w:rPr>
+        <w:t>---------------------------------------------</w:t>
+      </w:r>
+    </w:p>
+    <w:p>
+      <w:pPr>
+        <w:rPr>
+          <w:lang w:val="en-GB"/>
+        </w:rPr>
+      </w:pPr>
+      <w:r>
+        <w:rPr>
+          <w:lang w:val="en-GB"/>
+        </w:rPr>
+        <w:t xml:space="preserve">    Filters:           96</w:t>
+      </w:r>
+    </w:p>
+    <w:p>
+      <w:pPr>
+        <w:rPr>
+          <w:lang w:val="en-GB"/>
+        </w:rPr>
+      </w:pPr>
+      <w:r>
+        <w:rPr>
+          <w:lang w:val="en-GB"/>
+        </w:rPr>
+        <w:t xml:space="preserve">    Kernel Size:       3</w:t>
+      </w:r>
+    </w:p>
+    <w:p>
+      <w:pPr>
+        <w:rPr>
+          <w:lang w:val="en-GB"/>
+        </w:rPr>
+      </w:pPr>
+      <w:r>
+        <w:rPr>
+          <w:lang w:val="en-GB"/>
+        </w:rPr>
+        <w:t xml:space="preserve">    Second Layer?:     False</w:t>
+      </w:r>
+    </w:p>
+    <w:p>
+      <w:pPr>
+        <w:rPr>
+          <w:lang w:val="en-GB"/>
+        </w:rPr>
+      </w:pPr>
+      <w:r>
+        <w:rPr>
+          <w:lang w:val="en-GB"/>
+        </w:rPr>
+        <w:t xml:space="preserve">    Dense Context:     32</w:t>
+      </w:r>
+    </w:p>
+    <w:p>
+      <w:pPr>
+        <w:rPr>
+          <w:lang w:val="en-GB"/>
+        </w:rPr>
+      </w:pPr>
+      <w:r>
+        <w:rPr>
+          <w:lang w:val="en-GB"/>
+        </w:rPr>
+        <w:t xml:space="preserve">    Dense Final:       64</w:t>
+      </w:r>
+    </w:p>
+    <w:p>
+      <w:pPr>
+        <w:rPr>
+          <w:lang w:val="en-GB"/>
+        </w:rPr>
+      </w:pPr>
+      <w:r>
+        <w:rPr>
+          <w:lang w:val="en-GB"/>
+        </w:rPr>
+        <w:t xml:space="preserve">    Dropout Rate:      0.30000000000000004</w:t>
+      </w:r>
+    </w:p>
+    <w:p>
+      <w:pPr>
+        <w:rPr>
+          <w:lang w:val="en-GB"/>
+        </w:rPr>
+      </w:pPr>
+      <w:r>
+        <w:rPr>
+          <w:lang w:val="en-GB"/>
+        </w:rPr>
+        <w:t xml:space="preserve">    Learning Rate:     0.001</w:t>
+      </w:r>
+    </w:p>
+    <w:p>
+      <w:pPr>
+        <w:rPr>
+          <w:lang w:val="en-GB"/>
+        </w:rPr>
+      </w:pPr>
+      <w:r>
+        <w:rPr>
+          <w:lang w:val="en-GB"/>
+        </w:rPr>
+        <w:t xml:space="preserve">    Cosine Weight:     12.0</w:t>
+      </w:r>
+    </w:p>
+    <w:p>
+      <w:pPr>
+        <w:rPr>
+          <w:lang w:val="en-GB"/>
+        </w:rPr>
+      </w:pPr>
+      <w:r>
+        <w:rPr>
+          <w:lang w:val="en-GB"/>
+        </w:rPr>
+        <w:t xml:space="preserve">    N_PAST : 2</w:t>
+      </w:r>
+    </w:p>
+    <w:p>
+      <w:pPr>
+        <w:rPr>
+          <w:lang w:val="en-GB"/>
+        </w:rPr>
+      </w:pPr>
+    </w:p>
+    <w:p>
+      <w:pPr>
+        <w:rPr>
+          <w:lang w:val="en-GB"/>
+        </w:rPr>
+      </w:pPr>
+    </w:p>
+    <w:p>
+      <w:r>
+        <w:rPr>
+          <w:rFonts w:ascii="Segoe UI Emoji" w:hAnsi="Segoe UI Emoji" w:cs="Segoe UI Emoji"/>
+          <w:lang w:val="en-GB"/>
+        </w:rPr>
+        <w:t>✅</w:t>
+      </w:r>
+      <w:r>
+        <w:rPr>
+          <w:lang w:val="en-GB"/>
+        </w:rPr>
+        <w:t xml:space="preserve"> TUNING CNN COMPLETATO! </w:t>
+      </w:r>
+      <w:r>
+        <w:t>Migliori Parametri</w:t>
+      </w:r>
+      <w:r>
+        <w:t xml:space="preserve"> Custom Loss</w:t>
+      </w:r>
+      <w:r>
+        <w:t>:</w:t>
+      </w:r>
+    </w:p>
+    <w:p>
+      <w:r>
+        <w:t xml:space="preserve">    </w:t>
+      </w:r>
+      <w:r>
+        <w:t>---------------------------------------------</w:t>
+      </w:r>
+    </w:p>
+    <w:p>
+      <w:r>
+        <w:t xml:space="preserve">    Filters:           96</w:t>
+      </w:r>
+    </w:p>
+    <w:p>
+      <w:r>
+        <w:t xml:space="preserve">    Kernel Size:       2</w:t>
+      </w:r>
+    </w:p>
+    <w:p>
+      <w:pPr>
+        <w:rPr>
+          <w:lang w:val="en-GB"/>
+        </w:rPr>
+      </w:pPr>
+      <w:r>
+        <w:t xml:space="preserve">    </w:t>
+      </w:r>
+      <w:r>
+        <w:rPr>
+          <w:lang w:val="en-GB"/>
+        </w:rPr>
+        <w:t>Second Layer?:     False</w:t>
+      </w:r>
+    </w:p>
+    <w:p>
+      <w:pPr>
+        <w:rPr>
+          <w:lang w:val="en-GB"/>
+        </w:rPr>
+      </w:pPr>
+      <w:r>
+        <w:rPr>
+          <w:lang w:val="en-GB"/>
+        </w:rPr>
+        <w:t xml:space="preserve">    Dense Context:     32</w:t>
+      </w:r>
+    </w:p>
+    <w:p>
+      <w:pPr>
+        <w:rPr>
+          <w:lang w:val="en-GB"/>
+        </w:rPr>
+      </w:pPr>
+      <w:r>
+        <w:rPr>
+          <w:lang w:val="en-GB"/>
+        </w:rPr>
+        <w:t xml:space="preserve">    Dense Final:       128</w:t>
+      </w:r>
+    </w:p>
+    <w:p>
+      <w:pPr>
+        <w:rPr>
+          <w:lang w:val="en-GB"/>
+        </w:rPr>
+      </w:pPr>
+      <w:r>
+        <w:rPr>
+          <w:lang w:val="en-GB"/>
+        </w:rPr>
+        <w:t xml:space="preserve">    Dropout Rate:      0.30000000000000004</w:t>
+      </w:r>
+    </w:p>
+    <w:p>
+      <w:pPr>
+        <w:rPr>
+          <w:lang w:val="en-GB"/>
+        </w:rPr>
+      </w:pPr>
+      <w:r>
+        <w:rPr>
+          <w:lang w:val="en-GB"/>
+        </w:rPr>
+        <w:t xml:space="preserve">    Learning Rate:     0.001</w:t>
+      </w:r>
+    </w:p>
+    <w:p>
+      <w:pPr>
+        <w:rPr>
+          <w:lang w:val="en-GB"/>
+        </w:rPr>
+      </w:pPr>
+      <w:r>
+        <w:rPr>
+          <w:lang w:val="en-GB"/>
+        </w:rPr>
+        <w:t xml:space="preserve">    Cosine Weight:     12.0</w:t>
+      </w:r>
+    </w:p>
+    <w:p>
+      <w:pPr>
+        <w:rPr>
+          <w:lang w:val="en-GB"/>
+        </w:rPr>
+      </w:pPr>
+      <w:r>
+        <w:rPr>
+          <w:lang w:val="en-GB"/>
+        </w:rPr>
+        <w:t xml:space="preserve">    N_PAST : 4</w:t>
+      </w:r>
+    </w:p>
+    <w:p>
+      <w:pPr>
+        <w:rPr>
+          <w:lang w:val="en-GB"/>
+        </w:rPr>
+      </w:pPr>
+    </w:p>
+    <w:p>
+      <w:pPr>
+        <w:rPr>
+          <w:lang w:val="en-GB"/>
+        </w:rPr>
+      </w:pPr>
+    </w:p>
+    <w:p>
+      <w:pPr>
+        <w:rPr>
+          <w:lang w:val="en-GB"/>
+        </w:rPr>
+      </w:pPr>
+    </w:p>
+    <w:p>
+      <w:pPr>
+        <w:rPr>
+          <w:lang w:val="en-GB"/>
+        </w:rPr>
+      </w:pPr>
+    </w:p>
+    <w:p>
+      <w:pPr>
+        <w:rPr>
+          <w:lang w:val="en-GB"/>
+        </w:rPr>
+      </w:pPr>
+    </w:p>
+    <w:p>
+      <w:pPr>
+        <w:rPr>
+          <w:lang w:val="en-GB"/>
+        </w:rPr>
+      </w:pPr>
+    </w:p>
+    <w:p>
+      <w:pPr>
+        <w:rPr>
+          <w:lang w:val="en-GB"/>
+        </w:rPr>
+      </w:pPr>
+    </w:p>
+    <w:p>
+      <w:pPr>
+        <w:rPr>
+          <w:lang w:val="en-GB"/>
+        </w:rPr>
+      </w:pPr>
+    </w:p>
+    <w:p>
+      <w:pPr>
+        <w:rPr>
+          <w:lang w:val="en-GB"/>
+        </w:rPr>
+      </w:pPr>
+      <w:r>
+        <w:rPr>
+          <w:lang w:val="en-GB"/>
+        </w:rPr>
+        <w:lastRenderedPageBreak/>
+        <w:t>ATTACCANTI:</w:t>
+      </w:r>
+    </w:p>
+    <w:p>
+      <w:pPr>
+        <w:rPr>
+          <w:lang w:val="en-GB"/>
+        </w:rPr>
+      </w:pPr>
+      <w:r>
+        <w:rPr>
+          <w:lang w:val="en-GB"/>
+        </w:rPr>
+        <w:t>(9100 training, 1700 validation, 1800 training)</w:t>
+      </w:r>
+    </w:p>
+    <w:p>
+      <w:r>
+        <w:rPr>
+          <w:rFonts w:ascii="Segoe UI Emoji" w:hAnsi="Segoe UI Emoji" w:cs="Segoe UI Emoji"/>
+          <w:lang w:val="en-GB"/>
+        </w:rPr>
+        <w:t>✅</w:t>
+      </w:r>
+      <w:r>
+        <w:rPr>
+          <w:lang w:val="en-GB"/>
+        </w:rPr>
+        <w:t xml:space="preserve"> TUNING COMPLETATO! </w:t>
+      </w:r>
+      <w:r>
+        <w:t>I Migliori Parametri sono</w:t>
+      </w:r>
+      <w:r>
+        <w:t xml:space="preserve"> LSTM Custom Loss</w:t>
+      </w:r>
+      <w:r>
+        <w:t>:</w:t>
+      </w:r>
+    </w:p>
+    <w:p>
+      <w:pPr>
+        <w:rPr>
+          <w:lang w:val="en-GB"/>
+        </w:rPr>
+      </w:pPr>
+      <w:r>
+        <w:t xml:space="preserve">    </w:t>
+      </w:r>
+      <w:r>
+        <w:rPr>
+          <w:lang w:val="en-GB"/>
+        </w:rPr>
+        <w:t>------------------------------------------------</w:t>
+      </w:r>
+    </w:p>
+    <w:p>
+      <w:pPr>
+        <w:rPr>
+          <w:lang w:val="en-GB"/>
+        </w:rPr>
+      </w:pPr>
+      <w:r>
+        <w:rPr>
+          <w:lang w:val="en-GB"/>
+        </w:rPr>
+        <w:t xml:space="preserve">    LSTM Units:        96</w:t>
+      </w:r>
+    </w:p>
+    <w:p>
+      <w:pPr>
+        <w:rPr>
+          <w:lang w:val="en-GB"/>
+        </w:rPr>
+      </w:pPr>
+      <w:r>
+        <w:rPr>
+          <w:lang w:val="en-GB"/>
+        </w:rPr>
+        <w:t xml:space="preserve">    Dense Context:     64</w:t>
+      </w:r>
+    </w:p>
+    <w:p>
+      <w:pPr>
+        <w:rPr>
+          <w:lang w:val="en-GB"/>
+        </w:rPr>
+      </w:pPr>
+      <w:r>
+        <w:rPr>
+          <w:lang w:val="en-GB"/>
+        </w:rPr>
+        <w:t xml:space="preserve">    Dense Final:       128</w:t>
+      </w:r>
+    </w:p>
+    <w:p>
+      <w:pPr>
+        <w:rPr>
+          <w:lang w:val="en-GB"/>
+        </w:rPr>
+      </w:pPr>
+      <w:r>
+        <w:rPr>
+          <w:lang w:val="en-GB"/>
+        </w:rPr>
+        <w:t xml:space="preserve">    Extra Layer?:      True</w:t>
+      </w:r>
+    </w:p>
+    <w:p>
+      <w:pPr>
+        <w:rPr>
+          <w:lang w:val="en-GB"/>
+        </w:rPr>
+      </w:pPr>
+      <w:r>
+        <w:rPr>
+          <w:lang w:val="en-GB"/>
+        </w:rPr>
+        <w:t xml:space="preserve">    Dropout Rate:      0.4</w:t>
+      </w:r>
+    </w:p>
+    <w:p>
+      <w:pPr>
+        <w:rPr>
+          <w:lang w:val="en-GB"/>
+        </w:rPr>
+      </w:pPr>
+      <w:r>
+        <w:rPr>
+          <w:lang w:val="en-GB"/>
+        </w:rPr>
+        <w:t xml:space="preserve">    Learning Rate:     0.001</w:t>
+      </w:r>
+    </w:p>
+    <w:p>
+      <w:pPr>
+        <w:rPr>
+          <w:lang w:val="en-GB"/>
+        </w:rPr>
+      </w:pPr>
+      <w:r>
+        <w:rPr>
+          <w:lang w:val="en-GB"/>
+        </w:rPr>
+        <w:t xml:space="preserve">    Loss Cosine Wgt:   10.0</w:t>
+      </w:r>
+    </w:p>
+    <w:p>
+      <w:pPr>
+        <w:rPr>
+          <w:lang w:val="en-GB"/>
+        </w:rPr>
+      </w:pPr>
+      <w:r>
+        <w:rPr>
+          <w:lang w:val="en-GB"/>
+        </w:rPr>
+        <w:t xml:space="preserve">    N_PAST : 4</w:t>
+      </w:r>
+    </w:p>
+    <w:p>
+      <w:pPr>
+        <w:rPr>
+          <w:lang w:val="en-GB"/>
+        </w:rPr>
+      </w:pPr>
+    </w:p>
+    <w:p>
+      <w:r>
+        <w:rPr>
+          <w:rFonts w:ascii="Segoe UI Emoji" w:hAnsi="Segoe UI Emoji" w:cs="Segoe UI Emoji"/>
+        </w:rPr>
+        <w:t>✅</w:t>
+      </w:r>
+      <w:r>
+        <w:t xml:space="preserve"> TUNING COMPLETATO! I Migliori Parametri sono</w:t>
+      </w:r>
+      <w:r>
+        <w:t xml:space="preserve"> LSTM MAE</w:t>
+      </w:r>
+      <w:r>
+        <w:t>:</w:t>
+      </w:r>
+    </w:p>
+    <w:p>
+      <w:pPr>
+        <w:rPr>
+          <w:lang w:val="en-GB"/>
+        </w:rPr>
+      </w:pPr>
+      <w:r>
+        <w:t xml:space="preserve">    </w:t>
+      </w:r>
+      <w:r>
+        <w:rPr>
+          <w:lang w:val="en-GB"/>
+        </w:rPr>
+        <w:t>------------------------------------------------</w:t>
+      </w:r>
+    </w:p>
+    <w:p>
+      <w:pPr>
+        <w:rPr>
+          <w:lang w:val="en-GB"/>
+        </w:rPr>
+      </w:pPr>
+      <w:r>
+        <w:rPr>
+          <w:lang w:val="en-GB"/>
+        </w:rPr>
+        <w:t xml:space="preserve">    LSTM Units:        32</w:t>
+      </w:r>
+    </w:p>
+    <w:p>
+      <w:pPr>
+        <w:rPr>
+          <w:lang w:val="en-GB"/>
+        </w:rPr>
+      </w:pPr>
+      <w:r>
+        <w:rPr>
+          <w:lang w:val="en-GB"/>
+        </w:rPr>
+        <w:t xml:space="preserve">    Dense Context:     48</w:t>
+      </w:r>
+    </w:p>
+    <w:p>
+      <w:pPr>
+        <w:rPr>
+          <w:lang w:val="en-GB"/>
+        </w:rPr>
+      </w:pPr>
+      <w:r>
+        <w:rPr>
+          <w:lang w:val="en-GB"/>
+        </w:rPr>
+        <w:t xml:space="preserve">    Dense Final:       32</w:t>
+      </w:r>
+    </w:p>
+    <w:p>
+      <w:pPr>
+        <w:rPr>
+          <w:lang w:val="en-GB"/>
+        </w:rPr>
+      </w:pPr>
+      <w:r>
+        <w:rPr>
+          <w:lang w:val="en-GB"/>
+        </w:rPr>
+        <w:t xml:space="preserve">    Extra Layer?:      True</w:t>
+      </w:r>
+    </w:p>
+    <w:p>
+      <w:pPr>
+        <w:rPr>
+          <w:lang w:val="en-GB"/>
+        </w:rPr>
+      </w:pPr>
+      <w:r>
+        <w:rPr>
+          <w:lang w:val="en-GB"/>
+        </w:rPr>
+        <w:t xml:space="preserve">    Dropout Rate:      0.30000000000000004</w:t>
+      </w:r>
+    </w:p>
+    <w:p>
+      <w:pPr>
+        <w:rPr>
+          <w:lang w:val="en-GB"/>
+        </w:rPr>
+      </w:pPr>
+      <w:r>
+        <w:rPr>
+          <w:lang w:val="en-GB"/>
+        </w:rPr>
+        <w:t xml:space="preserve">    Learning Rate:     0.001</w:t>
+      </w:r>
+    </w:p>
+    <w:p>
+      <w:pPr>
+        <w:rPr>
+          <w:lang w:val="en-GB"/>
+        </w:rPr>
+      </w:pPr>
+      <w:r>
+        <w:rPr>
+          <w:lang w:val="en-GB"/>
+        </w:rPr>
+        <w:t xml:space="preserve">    Loss Cosine Wgt:   8.0</w:t>
+      </w:r>
+    </w:p>
+    <w:p>
+      <w:pPr>
+        <w:rPr>
+          <w:lang w:val="en-GB"/>
+        </w:rPr>
+      </w:pPr>
+      <w:r>
+        <w:rPr>
+          <w:lang w:val="en-GB"/>
+        </w:rPr>
+        <w:t xml:space="preserve">    N_PAST : 4</w:t>
+      </w:r>
+    </w:p>
+    <w:p>
+      <w:pPr>
+        <w:rPr>
+          <w:lang w:val="en-GB"/>
+        </w:rPr>
+      </w:pPr>
+    </w:p>
+    <w:p/>
+    <w:p/>
+    <w:p/>
+    <w:p/>
+    <w:p/>
+    <w:p/>
+    <w:p/>
+    <w:p/>
+    <w:p>
+      <w:r>
+        <w:lastRenderedPageBreak/>
+        <w:t>TUNING CNN COMPLETATO! Migliori Parametri</w:t>
+      </w:r>
+      <w:r>
+        <w:t xml:space="preserve"> MAE</w:t>
+      </w:r>
+      <w:r>
+        <w:t>:</w:t>
+      </w:r>
+    </w:p>
+    <w:p>
+      <w:pPr>
+        <w:rPr>
+          <w:lang w:val="en-GB"/>
+        </w:rPr>
+      </w:pPr>
+      <w:r>
+        <w:t xml:space="preserve">    </w:t>
+      </w:r>
+      <w:r>
+        <w:rPr>
+          <w:lang w:val="en-GB"/>
+        </w:rPr>
+        <w:t>---------------------------------------------</w:t>
+      </w:r>
+    </w:p>
+    <w:p>
+      <w:pPr>
+        <w:rPr>
+          <w:lang w:val="en-GB"/>
+        </w:rPr>
+      </w:pPr>
+      <w:r>
+        <w:rPr>
+          <w:lang w:val="en-GB"/>
+        </w:rPr>
+        <w:t xml:space="preserve">    Filters:           32</w:t>
+      </w:r>
+    </w:p>
+    <w:p>
+      <w:pPr>
+        <w:rPr>
+          <w:lang w:val="en-GB"/>
+        </w:rPr>
+      </w:pPr>
+      <w:r>
+        <w:rPr>
+          <w:lang w:val="en-GB"/>
+        </w:rPr>
+        <w:t xml:space="preserve">    Kernel Size:       3</w:t>
+      </w:r>
+    </w:p>
+    <w:p>
+      <w:pPr>
+        <w:rPr>
+          <w:lang w:val="en-GB"/>
+        </w:rPr>
+      </w:pPr>
+      <w:r>
+        <w:rPr>
+          <w:lang w:val="en-GB"/>
+        </w:rPr>
+        <w:t xml:space="preserve">    Second Layer?:     False</w:t>
+      </w:r>
+    </w:p>
+    <w:p>
+      <w:pPr>
+        <w:rPr>
+          <w:lang w:val="en-GB"/>
+        </w:rPr>
+      </w:pPr>
+      <w:r>
+        <w:rPr>
+          <w:lang w:val="en-GB"/>
+        </w:rPr>
+        <w:t xml:space="preserve">    Dense Context:     16</w:t>
+      </w:r>
+    </w:p>
+    <w:p>
+      <w:pPr>
+        <w:rPr>
+          <w:lang w:val="en-GB"/>
+        </w:rPr>
+      </w:pPr>
+      <w:r>
+        <w:rPr>
+          <w:lang w:val="en-GB"/>
+        </w:rPr>
+        <w:t xml:space="preserve">    Dense Final:       96</w:t>
+      </w:r>
+    </w:p>
+    <w:p>
+      <w:pPr>
+        <w:rPr>
+          <w:lang w:val="en-GB"/>
+        </w:rPr>
+      </w:pPr>
+      <w:r>
+        <w:rPr>
+          <w:lang w:val="en-GB"/>
+        </w:rPr>
+        <w:t xml:space="preserve">    Dropout Rate:      0.4</w:t>
+      </w:r>
+    </w:p>
+    <w:p>
+      <w:pPr>
+        <w:rPr>
+          <w:lang w:val="en-GB"/>
+        </w:rPr>
+      </w:pPr>
+      <w:r>
+        <w:rPr>
+          <w:lang w:val="en-GB"/>
+        </w:rPr>
+        <w:t xml:space="preserve">    Learning Rate:     0.0005</w:t>
+      </w:r>
+    </w:p>
+    <w:p>
+      <w:pPr>
+        <w:rPr>
+          <w:lang w:val="en-GB"/>
+        </w:rPr>
+      </w:pPr>
+      <w:r>
+        <w:rPr>
+          <w:lang w:val="en-GB"/>
+        </w:rPr>
+        <w:t xml:space="preserve">    Cosine Weight:     12.0</w:t>
+      </w:r>
+    </w:p>
+    <w:p>
+      <w:pPr>
+        <w:rPr>
+          <w:lang w:val="en-GB"/>
+        </w:rPr>
+      </w:pPr>
+      <w:r>
+        <w:rPr>
+          <w:lang w:val="en-GB"/>
+        </w:rPr>
+        <w:t xml:space="preserve">    N_PAST : 4</w:t>
+      </w:r>
+    </w:p>
+    <w:p>
+      <w:pPr>
+        <w:rPr>
+          <w:lang w:val="en-GB"/>
+        </w:rPr>
+      </w:pPr>
+    </w:p>
+    <w:p>
+      <w:r>
+        <w:t>TUNING CNN COMPLETATO! Migliori Parametri</w:t>
+      </w:r>
+      <w:r>
+        <w:t xml:space="preserve"> Custom Loss</w:t>
+      </w:r>
+      <w:r>
+        <w:t>:</w:t>
+      </w:r>
+    </w:p>
+    <w:p>
+      <w:pPr>
+        <w:rPr>
+          <w:lang w:val="en-GB"/>
+        </w:rPr>
+      </w:pPr>
+      <w:r>
+        <w:t xml:space="preserve">    </w:t>
+      </w:r>
+      <w:r>
+        <w:rPr>
+          <w:lang w:val="en-GB"/>
+        </w:rPr>
+        <w:t>---------------------------------------------</w:t>
+      </w:r>
+    </w:p>
+    <w:p>
+      <w:pPr>
+        <w:rPr>
+          <w:lang w:val="en-GB"/>
+        </w:rPr>
+      </w:pPr>
+      <w:r>
+        <w:rPr>
+          <w:lang w:val="en-GB"/>
+        </w:rPr>
+        <w:t xml:space="preserve">    Filters:           32</w:t>
+      </w:r>
+    </w:p>
+    <w:p>
+      <w:pPr>
+        <w:rPr>
+          <w:lang w:val="en-GB"/>
+        </w:rPr>
+      </w:pPr>
+      <w:r>
+        <w:rPr>
+          <w:lang w:val="en-GB"/>
+        </w:rPr>
+        <w:t xml:space="preserve">    Kernel Size:       2</w:t>
+      </w:r>
+    </w:p>
+    <w:p>
+      <w:pPr>
+        <w:rPr>
+          <w:lang w:val="en-GB"/>
+        </w:rPr>
+      </w:pPr>
+      <w:r>
+        <w:rPr>
+          <w:lang w:val="en-GB"/>
+        </w:rPr>
+        <w:t xml:space="preserve">    Second Layer?:     False</w:t>
+      </w:r>
+    </w:p>
+    <w:p>
+      <w:pPr>
+        <w:rPr>
+          <w:lang w:val="en-GB"/>
+        </w:rPr>
+      </w:pPr>
+      <w:r>
+        <w:rPr>
+          <w:lang w:val="en-GB"/>
+        </w:rPr>
+        <w:t xml:space="preserve">    Dense Context:     16</w:t>
+      </w:r>
+    </w:p>
+    <w:p>
+      <w:pPr>
+        <w:rPr>
+          <w:lang w:val="en-GB"/>
+        </w:rPr>
+      </w:pPr>
+      <w:r>
+        <w:rPr>
+          <w:lang w:val="en-GB"/>
+        </w:rPr>
+        <w:t xml:space="preserve">    Dense Final:       96</w:t>
+      </w:r>
+    </w:p>
+    <w:p>
+      <w:pPr>
+        <w:rPr>
+          <w:lang w:val="en-GB"/>
+        </w:rPr>
+      </w:pPr>
+      <w:r>
+        <w:rPr>
+          <w:lang w:val="en-GB"/>
+        </w:rPr>
+        <w:t xml:space="preserve">    Dropout Rate:      0.4</w:t>
+      </w:r>
+    </w:p>
+    <w:p>
+      <w:pPr>
+        <w:rPr>
+          <w:lang w:val="en-GB"/>
+        </w:rPr>
+      </w:pPr>
+      <w:r>
+        <w:rPr>
+          <w:lang w:val="en-GB"/>
+        </w:rPr>
+        <w:t xml:space="preserve">    Learning Rate:     0.001</w:t>
+      </w:r>
+    </w:p>
+    <w:p>
+      <w:pPr>
+        <w:rPr>
+          <w:lang w:val="en-GB"/>
+        </w:rPr>
+      </w:pPr>
+      <w:r>
+        <w:rPr>
+          <w:lang w:val="en-GB"/>
+        </w:rPr>
+        <w:t xml:space="preserve">    Cosine Weight:     12.0</w:t>
+      </w:r>
+    </w:p>
+    <w:p>
+      <w:pPr>
+        <w:rPr>
+          <w:lang w:val="en-GB"/>
+        </w:rPr>
+      </w:pPr>
+      <w:r>
+        <w:rPr>
+          <w:lang w:val="en-GB"/>
+        </w:rPr>
+        <w:t xml:space="preserve">    N_PAST : 3</w:t>
+      </w:r>
+    </w:p>
+    <w:p>
+      <w:pPr>
+        <w:rPr>
+          <w:lang w:val="en-GB"/>
+        </w:rPr>
+      </w:pPr>
+    </w:p>
+    <w:p>
+      <w:pPr>
+        <w:rPr>
+          <w:lang w:val="en-GB"/>
+        </w:rPr>
+      </w:pPr>
+    </w:p>
+    <w:p>
+      <w:pPr>
+        <w:rPr>
+          <w:lang w:val="en-GB"/>
+        </w:rPr>
+      </w:pPr>
+    </w:p>
     <w:sectPr>
       <w:pgSz w:w="11906" w:h="16838"/>
       <w:pgMar w:top="1417" w:right="1134" w:bottom="1134" w:left="1134" w:header="708" w:footer="708" w:gutter="0"/>

</xml_diff>